<commit_message>
update modul 14 v2
</commit_message>
<xml_diff>
--- a/assets/file/materi/Modul Pertemuan 14 - Session.docx
+++ b/assets/file/materi/Modul Pertemuan 14 - Session.docx
@@ -2980,15 +2980,7 @@
                                 <w:sz w:val="20"/>
                                 <w:szCs w:val="20"/>
                               </w:rPr>
-                              <w:t xml:space="preserve">    </w:t>
-                            </w:r>
-                            <w:r>
-                              <w:rPr>
-                                <w:rFonts w:ascii="Courier New" w:hAnsi="Courier New" w:cs="Courier New"/>
-                                <w:sz w:val="20"/>
-                                <w:szCs w:val="20"/>
-                              </w:rPr>
-                              <w:t>'username' =&gt; 'required',</w:t>
+                              <w:t xml:space="preserve">    'username' =&gt; 'required',</w:t>
                             </w:r>
                           </w:p>
                           <w:p>
@@ -3079,15 +3071,7 @@
                           <w:sz w:val="20"/>
                           <w:szCs w:val="20"/>
                         </w:rPr>
-                        <w:t xml:space="preserve">    </w:t>
-                      </w:r>
-                      <w:r>
-                        <w:rPr>
-                          <w:rFonts w:ascii="Courier New" w:hAnsi="Courier New" w:cs="Courier New"/>
-                          <w:sz w:val="20"/>
-                          <w:szCs w:val="20"/>
-                        </w:rPr>
-                        <w:t>'username' =&gt; 'required',</w:t>
+                        <w:t xml:space="preserve">    'username' =&gt; 'required',</w:t>
                       </w:r>
                     </w:p>
                     <w:p>
@@ -3409,15 +3393,7 @@
                                 <w:sz w:val="20"/>
                                 <w:szCs w:val="20"/>
                               </w:rPr>
-                              <w:t xml:space="preserve">class </w:t>
-                            </w:r>
-                            <w:r>
-                              <w:rPr>
-                                <w:rFonts w:ascii="Courier New" w:hAnsi="Courier New" w:cs="Courier New"/>
-                                <w:sz w:val="20"/>
-                                <w:szCs w:val="20"/>
-                              </w:rPr>
-                              <w:t>Validation</w:t>
+                              <w:t>class Validation</w:t>
                             </w:r>
                           </w:p>
                           <w:p>
@@ -3598,15 +3574,7 @@
                           <w:sz w:val="20"/>
                           <w:szCs w:val="20"/>
                         </w:rPr>
-                        <w:t xml:space="preserve">class </w:t>
-                      </w:r>
-                      <w:r>
-                        <w:rPr>
-                          <w:rFonts w:ascii="Courier New" w:hAnsi="Courier New" w:cs="Courier New"/>
-                          <w:sz w:val="20"/>
-                          <w:szCs w:val="20"/>
-                        </w:rPr>
-                        <w:t>Validation</w:t>
+                        <w:t>class Validation</w:t>
                       </w:r>
                     </w:p>
                     <w:p>
@@ -3856,15 +3824,7 @@
                                 <w:sz w:val="20"/>
                                 <w:szCs w:val="20"/>
                               </w:rPr>
-                              <w:t xml:space="preserve">$validation-&gt;run($data, </w:t>
-                            </w:r>
-                            <w:r>
-                              <w:rPr>
-                                <w:rFonts w:ascii="Courier New" w:hAnsi="Courier New" w:cs="Courier New"/>
-                                <w:sz w:val="20"/>
-                                <w:szCs w:val="20"/>
-                              </w:rPr>
-                              <w:t>'signup');</w:t>
+                              <w:t>$validation-&gt;run($data, 'signup');</w:t>
                             </w:r>
                           </w:p>
                         </w:txbxContent>
@@ -3901,15 +3861,7 @@
                           <w:sz w:val="20"/>
                           <w:szCs w:val="20"/>
                         </w:rPr>
-                        <w:t xml:space="preserve">$validation-&gt;run($data, </w:t>
-                      </w:r>
-                      <w:r>
-                        <w:rPr>
-                          <w:rFonts w:ascii="Courier New" w:hAnsi="Courier New" w:cs="Courier New"/>
-                          <w:sz w:val="20"/>
-                          <w:szCs w:val="20"/>
-                        </w:rPr>
-                        <w:t>'signup');</w:t>
+                        <w:t>$validation-&gt;run($data, 'signup');</w:t>
                       </w:r>
                     </w:p>
                   </w:txbxContent>
@@ -4014,15 +3966,7 @@
                                 <w:sz w:val="20"/>
                                 <w:szCs w:val="20"/>
                               </w:rPr>
-                              <w:t xml:space="preserve">class </w:t>
-                            </w:r>
-                            <w:r>
-                              <w:rPr>
-                                <w:rFonts w:ascii="Courier New" w:hAnsi="Courier New" w:cs="Courier New"/>
-                                <w:sz w:val="20"/>
-                                <w:szCs w:val="20"/>
-                              </w:rPr>
-                              <w:t>Validation</w:t>
+                              <w:t>class Validation</w:t>
                             </w:r>
                           </w:p>
                           <w:p>
@@ -4357,15 +4301,7 @@
                           <w:sz w:val="20"/>
                           <w:szCs w:val="20"/>
                         </w:rPr>
-                        <w:t xml:space="preserve">class </w:t>
-                      </w:r>
-                      <w:r>
-                        <w:rPr>
-                          <w:rFonts w:ascii="Courier New" w:hAnsi="Courier New" w:cs="Courier New"/>
-                          <w:sz w:val="20"/>
-                          <w:szCs w:val="20"/>
-                        </w:rPr>
-                        <w:t>Validation</w:t>
+                        <w:t>class Validation</w:t>
                       </w:r>
                     </w:p>
                     <w:p>
@@ -5498,15 +5434,7 @@
                                 <w:sz w:val="20"/>
                                 <w:szCs w:val="20"/>
                               </w:rPr>
-                              <w:t xml:space="preserve">$errors </w:t>
-                            </w:r>
-                            <w:r>
-                              <w:rPr>
-                                <w:rFonts w:ascii="Courier New" w:hAnsi="Courier New" w:cs="Courier New"/>
-                                <w:sz w:val="20"/>
-                                <w:szCs w:val="20"/>
-                              </w:rPr>
-                              <w:t>= $validation-&gt;getErrors();</w:t>
+                              <w:t>$errors = $validation-&gt;getErrors();</w:t>
                             </w:r>
                           </w:p>
                           <w:p>
@@ -5643,15 +5571,7 @@
                           <w:sz w:val="20"/>
                           <w:szCs w:val="20"/>
                         </w:rPr>
-                        <w:t xml:space="preserve">$errors </w:t>
-                      </w:r>
-                      <w:r>
-                        <w:rPr>
-                          <w:rFonts w:ascii="Courier New" w:hAnsi="Courier New" w:cs="Courier New"/>
-                          <w:sz w:val="20"/>
-                          <w:szCs w:val="20"/>
-                        </w:rPr>
-                        <w:t>= $validation-&gt;getErrors();</w:t>
+                        <w:t>$errors = $validation-&gt;getErrors();</w:t>
                       </w:r>
                     </w:p>
                     <w:p>
@@ -6011,15 +5931,7 @@
                                 <w:sz w:val="20"/>
                                 <w:szCs w:val="20"/>
                               </w:rPr>
-                              <w:t xml:space="preserve">if </w:t>
-                            </w:r>
-                            <w:r>
-                              <w:rPr>
-                                <w:rFonts w:ascii="Courier New" w:hAnsi="Courier New" w:cs="Courier New"/>
-                                <w:sz w:val="20"/>
-                                <w:szCs w:val="20"/>
-                              </w:rPr>
-                              <w:t>($validation-&gt;hasError('username'))</w:t>
+                              <w:t>if ($validation-&gt;hasError('username'))</w:t>
                             </w:r>
                           </w:p>
                           <w:p>
@@ -6110,15 +6022,7 @@
                           <w:sz w:val="20"/>
                           <w:szCs w:val="20"/>
                         </w:rPr>
-                        <w:t xml:space="preserve">if </w:t>
-                      </w:r>
-                      <w:r>
-                        <w:rPr>
-                          <w:rFonts w:ascii="Courier New" w:hAnsi="Courier New" w:cs="Courier New"/>
-                          <w:sz w:val="20"/>
-                          <w:szCs w:val="20"/>
-                        </w:rPr>
-                        <w:t>($validation-&gt;hasError('username'))</w:t>
+                        <w:t>if ($validation-&gt;hasError('username'))</w:t>
                       </w:r>
                     </w:p>
                     <w:p>
@@ -6183,8 +6087,6 @@
           </mc:Fallback>
         </mc:AlternateContent>
       </w:r>
-      <w:bookmarkStart w:id="0" w:name="_GoBack"/>
-      <w:bookmarkEnd w:id="0"/>
     </w:p>
     <w:p>
       <w:pPr>
@@ -8721,255 +8623,6 @@
           <w:ilvl w:val="0"/>
           <w:numId w:val="14"/>
         </w:numPr>
-        <w:jc w:val="both"/>
-        <w:rPr>
-          <w:rFonts w:asciiTheme="majorHAnsi" w:hAnsiTheme="majorHAnsi" w:cstheme="majorHAnsi"/>
-        </w:rPr>
-      </w:pPr>
-      <w:r>
-        <w:rPr>
-          <w:rFonts w:ascii="Calibri" w:eastAsia="Calibri" w:hAnsi="Calibri" w:cs="Calibri"/>
-          <w:szCs w:val="22"/>
-          <w:lang w:val="id" w:eastAsia="en-US"/>
-        </w:rPr>
-        <w:lastRenderedPageBreak/>
-        <w:t>Jalankan</w:t>
-      </w:r>
-      <w:r>
-        <w:rPr>
-          <w:rFonts w:ascii="Calibri" w:eastAsia="Calibri" w:hAnsi="Calibri" w:cs="Calibri"/>
-          <w:szCs w:val="22"/>
-          <w:lang w:eastAsia="en-US"/>
-        </w:rPr>
-        <w:t xml:space="preserve"> </w:t>
-      </w:r>
-      <w:r>
-        <w:rPr>
-          <w:rFonts w:ascii="Calibri" w:eastAsia="Calibri" w:hAnsi="Calibri" w:cs="Calibri"/>
-          <w:b/>
-          <w:bCs/>
-          <w:szCs w:val="22"/>
-          <w:lang w:eastAsia="en-US"/>
-        </w:rPr>
-        <w:t>localhost:8080/</w:t>
-      </w:r>
-      <w:r>
-        <w:rPr>
-          <w:rFonts w:ascii="Calibri" w:eastAsia="Calibri" w:hAnsi="Calibri" w:cs="Calibri"/>
-          <w:b/>
-          <w:bCs/>
-          <w:szCs w:val="22"/>
-          <w:lang w:eastAsia="en-US"/>
-        </w:rPr>
-        <w:t>Dashboard</w:t>
-      </w:r>
-      <w:r>
-        <w:rPr>
-          <w:rFonts w:ascii="Calibri" w:eastAsia="Calibri" w:hAnsi="Calibri" w:cs="Calibri"/>
-          <w:color w:val="0000FF"/>
-          <w:szCs w:val="22"/>
-          <w:lang w:eastAsia="en-US"/>
-        </w:rPr>
-        <w:t xml:space="preserve">, </w:t>
-      </w:r>
-      <w:r>
-        <w:t>Maka akan tampil seperti gambar dibawah</w:t>
-      </w:r>
-    </w:p>
-    <w:p>
-      <w:pPr>
-        <w:pStyle w:val="ListParagraph"/>
-        <w:rPr>
-          <w:rFonts w:asciiTheme="majorHAnsi" w:hAnsiTheme="majorHAnsi" w:cstheme="majorHAnsi"/>
-        </w:rPr>
-      </w:pPr>
-      <w:r>
-        <w:rPr>
-          <w:rFonts w:asciiTheme="majorHAnsi" w:hAnsiTheme="majorHAnsi" w:cstheme="majorHAnsi"/>
-          <w:noProof/>
-          <w:lang w:val="en-US" w:eastAsia="en-US"/>
-        </w:rPr>
-        <w:drawing>
-          <wp:inline distT="0" distB="0" distL="0" distR="0" wp14:anchorId="150A0491" wp14:editId="34594845">
-            <wp:extent cx="5040000" cy="2682077"/>
-            <wp:effectExtent l="0" t="0" r="8255" b="4445"/>
-            <wp:docPr id="235" name="Picture 235"/>
-            <wp:cNvGraphicFramePr>
-              <a:graphicFrameLocks xmlns:a="http://schemas.openxmlformats.org/drawingml/2006/main" noChangeAspect="1"/>
-            </wp:cNvGraphicFramePr>
-            <a:graphic xmlns:a="http://schemas.openxmlformats.org/drawingml/2006/main">
-              <a:graphicData uri="http://schemas.openxmlformats.org/drawingml/2006/picture">
-                <pic:pic xmlns:pic="http://schemas.openxmlformats.org/drawingml/2006/picture">
-                  <pic:nvPicPr>
-                    <pic:cNvPr id="0" name=""/>
-                    <pic:cNvPicPr/>
-                  </pic:nvPicPr>
-                  <pic:blipFill>
-                    <a:blip r:embed="rId27"/>
-                    <a:stretch>
-                      <a:fillRect/>
-                    </a:stretch>
-                  </pic:blipFill>
-                  <pic:spPr>
-                    <a:xfrm>
-                      <a:off x="0" y="0"/>
-                      <a:ext cx="5040000" cy="2682077"/>
-                    </a:xfrm>
-                    <a:prstGeom prst="rect">
-                      <a:avLst/>
-                    </a:prstGeom>
-                  </pic:spPr>
-                </pic:pic>
-              </a:graphicData>
-            </a:graphic>
-          </wp:inline>
-        </w:drawing>
-      </w:r>
-    </w:p>
-    <w:p>
-      <w:pPr>
-        <w:pStyle w:val="ListParagraph"/>
-        <w:rPr>
-          <w:rFonts w:asciiTheme="majorHAnsi" w:hAnsiTheme="majorHAnsi" w:cstheme="majorHAnsi"/>
-        </w:rPr>
-      </w:pPr>
-      <w:r>
-        <w:rPr>
-          <w:rFonts w:asciiTheme="majorHAnsi" w:hAnsiTheme="majorHAnsi" w:cstheme="majorHAnsi"/>
-        </w:rPr>
-        <w:t xml:space="preserve">Address diatas akan mengarahkan ke </w:t>
-      </w:r>
-      <w:r>
-        <w:rPr>
-          <w:rFonts w:asciiTheme="majorHAnsi" w:hAnsiTheme="majorHAnsi" w:cstheme="majorHAnsi"/>
-          <w:b/>
-          <w:bCs/>
-        </w:rPr>
-        <w:t>localhost:8080/Login</w:t>
-      </w:r>
-      <w:r>
-        <w:rPr>
-          <w:rFonts w:asciiTheme="majorHAnsi" w:hAnsiTheme="majorHAnsi" w:cstheme="majorHAnsi"/>
-        </w:rPr>
-        <w:t>, karena user belum login</w:t>
-      </w:r>
-    </w:p>
-    <w:p>
-      <w:pPr>
-        <w:pStyle w:val="ListParagraph"/>
-        <w:numPr>
-          <w:ilvl w:val="0"/>
-          <w:numId w:val="14"/>
-        </w:numPr>
-        <w:rPr>
-          <w:rFonts w:asciiTheme="majorHAnsi" w:hAnsiTheme="majorHAnsi" w:cstheme="majorHAnsi"/>
-        </w:rPr>
-      </w:pPr>
-      <w:r>
-        <w:rPr>
-          <w:rFonts w:asciiTheme="majorHAnsi" w:hAnsiTheme="majorHAnsi" w:cstheme="majorHAnsi"/>
-        </w:rPr>
-        <w:t xml:space="preserve">Buka file </w:t>
-      </w:r>
-      <w:r>
-        <w:rPr>
-          <w:rFonts w:asciiTheme="majorHAnsi" w:hAnsiTheme="majorHAnsi" w:cstheme="majorHAnsi"/>
-          <w:b/>
-          <w:bCs/>
-        </w:rPr>
-        <w:t>Login.php</w:t>
-      </w:r>
-      <w:r>
-        <w:rPr>
-          <w:rFonts w:asciiTheme="majorHAnsi" w:hAnsiTheme="majorHAnsi" w:cstheme="majorHAnsi"/>
-        </w:rPr>
-        <w:t xml:space="preserve"> pada folder </w:t>
-      </w:r>
-      <w:r>
-        <w:rPr>
-          <w:rFonts w:asciiTheme="majorHAnsi" w:hAnsiTheme="majorHAnsi" w:cstheme="majorHAnsi"/>
-          <w:b/>
-          <w:bCs/>
-        </w:rPr>
-        <w:t>app\Controllers</w:t>
-      </w:r>
-      <w:r>
-        <w:rPr>
-          <w:rFonts w:asciiTheme="majorHAnsi" w:hAnsiTheme="majorHAnsi" w:cstheme="majorHAnsi"/>
-        </w:rPr>
-        <w:t xml:space="preserve"> dan tambahkan kode berikut</w:t>
-      </w:r>
-    </w:p>
-    <w:p>
-      <w:pPr>
-        <w:pStyle w:val="ListParagraph"/>
-        <w:rPr>
-          <w:rFonts w:asciiTheme="majorHAnsi" w:hAnsiTheme="majorHAnsi" w:cstheme="majorHAnsi"/>
-        </w:rPr>
-      </w:pPr>
-      <w:r>
-        <w:rPr>
-          <w:rFonts w:asciiTheme="majorHAnsi" w:hAnsiTheme="majorHAnsi" w:cstheme="majorHAnsi"/>
-          <w:noProof/>
-          <w:lang w:val="en-US" w:eastAsia="en-US"/>
-        </w:rPr>
-        <w:drawing>
-          <wp:inline distT="0" distB="0" distL="0" distR="0" wp14:anchorId="24CDB604" wp14:editId="76E9AA48">
-            <wp:extent cx="5040000" cy="3523376"/>
-            <wp:effectExtent l="0" t="0" r="8255" b="1270"/>
-            <wp:docPr id="243" name="Picture 243"/>
-            <wp:cNvGraphicFramePr>
-              <a:graphicFrameLocks xmlns:a="http://schemas.openxmlformats.org/drawingml/2006/main" noChangeAspect="1"/>
-            </wp:cNvGraphicFramePr>
-            <a:graphic xmlns:a="http://schemas.openxmlformats.org/drawingml/2006/main">
-              <a:graphicData uri="http://schemas.openxmlformats.org/drawingml/2006/picture">
-                <pic:pic xmlns:pic="http://schemas.openxmlformats.org/drawingml/2006/picture">
-                  <pic:nvPicPr>
-                    <pic:cNvPr id="0" name=""/>
-                    <pic:cNvPicPr/>
-                  </pic:nvPicPr>
-                  <pic:blipFill>
-                    <a:blip r:embed="rId28"/>
-                    <a:stretch>
-                      <a:fillRect/>
-                    </a:stretch>
-                  </pic:blipFill>
-                  <pic:spPr>
-                    <a:xfrm>
-                      <a:off x="0" y="0"/>
-                      <a:ext cx="5040000" cy="3523376"/>
-                    </a:xfrm>
-                    <a:prstGeom prst="rect">
-                      <a:avLst/>
-                    </a:prstGeom>
-                  </pic:spPr>
-                </pic:pic>
-              </a:graphicData>
-            </a:graphic>
-          </wp:inline>
-        </w:drawing>
-      </w:r>
-    </w:p>
-    <w:p>
-      <w:pPr>
-        <w:rPr>
-          <w:rFonts w:asciiTheme="majorHAnsi" w:hAnsiTheme="majorHAnsi" w:cstheme="majorHAnsi"/>
-        </w:rPr>
-      </w:pPr>
-      <w:r>
-        <w:rPr>
-          <w:rFonts w:asciiTheme="majorHAnsi" w:hAnsiTheme="majorHAnsi" w:cstheme="majorHAnsi"/>
-        </w:rPr>
-        <w:br w:type="page"/>
-      </w:r>
-    </w:p>
-    <w:p>
-      <w:pPr>
-        <w:pStyle w:val="ListParagraph"/>
-        <w:numPr>
-          <w:ilvl w:val="0"/>
-          <w:numId w:val="14"/>
-        </w:numPr>
         <w:rPr>
           <w:rFonts w:asciiTheme="majorHAnsi" w:hAnsiTheme="majorHAnsi" w:cstheme="majorHAnsi"/>
         </w:rPr>
@@ -9047,7 +8700,7 @@
                     <pic:cNvPicPr/>
                   </pic:nvPicPr>
                   <pic:blipFill>
-                    <a:blip r:embed="rId29"/>
+                    <a:blip r:embed="rId27"/>
                     <a:stretch>
                       <a:fillRect/>
                     </a:stretch>
@@ -9219,7 +8872,7 @@
                     <pic:cNvPicPr/>
                   </pic:nvPicPr>
                   <pic:blipFill>
-                    <a:blip r:embed="rId30"/>
+                    <a:blip r:embed="rId28"/>
                     <a:stretch>
                       <a:fillRect/>
                     </a:stretch>
@@ -9305,6 +8958,243 @@
             <wp:extent cx="3572374" cy="1276528"/>
             <wp:effectExtent l="0" t="0" r="9525" b="0"/>
             <wp:docPr id="250" name="Picture 250"/>
+            <wp:cNvGraphicFramePr>
+              <a:graphicFrameLocks xmlns:a="http://schemas.openxmlformats.org/drawingml/2006/main" noChangeAspect="1"/>
+            </wp:cNvGraphicFramePr>
+            <a:graphic xmlns:a="http://schemas.openxmlformats.org/drawingml/2006/main">
+              <a:graphicData uri="http://schemas.openxmlformats.org/drawingml/2006/picture">
+                <pic:pic xmlns:pic="http://schemas.openxmlformats.org/drawingml/2006/picture">
+                  <pic:nvPicPr>
+                    <pic:cNvPr id="0" name=""/>
+                    <pic:cNvPicPr/>
+                  </pic:nvPicPr>
+                  <pic:blipFill>
+                    <a:blip r:embed="rId29"/>
+                    <a:stretch>
+                      <a:fillRect/>
+                    </a:stretch>
+                  </pic:blipFill>
+                  <pic:spPr>
+                    <a:xfrm>
+                      <a:off x="0" y="0"/>
+                      <a:ext cx="3572374" cy="1276528"/>
+                    </a:xfrm>
+                    <a:prstGeom prst="rect">
+                      <a:avLst/>
+                    </a:prstGeom>
+                  </pic:spPr>
+                </pic:pic>
+              </a:graphicData>
+            </a:graphic>
+          </wp:inline>
+        </w:drawing>
+      </w:r>
+    </w:p>
+    <w:p>
+      <w:pPr>
+        <w:pStyle w:val="ListParagraph"/>
+        <w:numPr>
+          <w:ilvl w:val="0"/>
+          <w:numId w:val="14"/>
+        </w:numPr>
+        <w:jc w:val="both"/>
+        <w:rPr>
+          <w:rFonts w:asciiTheme="majorHAnsi" w:hAnsiTheme="majorHAnsi" w:cstheme="majorHAnsi"/>
+        </w:rPr>
+      </w:pPr>
+      <w:r>
+        <w:rPr>
+          <w:rFonts w:ascii="Calibri" w:eastAsia="Calibri" w:hAnsi="Calibri" w:cs="Calibri"/>
+          <w:szCs w:val="22"/>
+          <w:lang w:val="id" w:eastAsia="en-US"/>
+        </w:rPr>
+        <w:t>Jalankan</w:t>
+      </w:r>
+      <w:r>
+        <w:rPr>
+          <w:rFonts w:ascii="Calibri" w:eastAsia="Calibri" w:hAnsi="Calibri" w:cs="Calibri"/>
+          <w:szCs w:val="22"/>
+          <w:lang w:eastAsia="en-US"/>
+        </w:rPr>
+        <w:t xml:space="preserve"> </w:t>
+      </w:r>
+      <w:r>
+        <w:rPr>
+          <w:rFonts w:ascii="Calibri" w:eastAsia="Calibri" w:hAnsi="Calibri" w:cs="Calibri"/>
+          <w:b/>
+          <w:bCs/>
+          <w:szCs w:val="22"/>
+          <w:lang w:eastAsia="en-US"/>
+        </w:rPr>
+        <w:t>localhost:8080/</w:t>
+      </w:r>
+      <w:r>
+        <w:rPr>
+          <w:rFonts w:ascii="Calibri" w:eastAsia="Calibri" w:hAnsi="Calibri" w:cs="Calibri"/>
+          <w:b/>
+          <w:bCs/>
+          <w:szCs w:val="22"/>
+          <w:lang w:eastAsia="en-US"/>
+        </w:rPr>
+        <w:t>Dashboard</w:t>
+      </w:r>
+      <w:r>
+        <w:rPr>
+          <w:rFonts w:ascii="Calibri" w:eastAsia="Calibri" w:hAnsi="Calibri" w:cs="Calibri"/>
+          <w:color w:val="0000FF"/>
+          <w:szCs w:val="22"/>
+          <w:lang w:eastAsia="en-US"/>
+        </w:rPr>
+        <w:t xml:space="preserve">, </w:t>
+      </w:r>
+      <w:r>
+        <w:t>Maka akan tampil seperti gambar dibawah</w:t>
+      </w:r>
+    </w:p>
+    <w:p>
+      <w:pPr>
+        <w:pStyle w:val="ListParagraph"/>
+        <w:rPr>
+          <w:rFonts w:asciiTheme="majorHAnsi" w:hAnsiTheme="majorHAnsi" w:cstheme="majorHAnsi"/>
+        </w:rPr>
+      </w:pPr>
+      <w:r>
+        <w:rPr>
+          <w:rFonts w:asciiTheme="majorHAnsi" w:hAnsiTheme="majorHAnsi" w:cstheme="majorHAnsi"/>
+          <w:noProof/>
+          <w:lang w:val="en-US" w:eastAsia="en-US"/>
+        </w:rPr>
+        <w:drawing>
+          <wp:inline distT="0" distB="0" distL="0" distR="0" wp14:anchorId="42D14A15" wp14:editId="7213D63A">
+            <wp:extent cx="5040000" cy="2682077"/>
+            <wp:effectExtent l="0" t="0" r="8255" b="4445"/>
+            <wp:docPr id="251" name="Picture 251"/>
+            <wp:cNvGraphicFramePr>
+              <a:graphicFrameLocks xmlns:a="http://schemas.openxmlformats.org/drawingml/2006/main" noChangeAspect="1"/>
+            </wp:cNvGraphicFramePr>
+            <a:graphic xmlns:a="http://schemas.openxmlformats.org/drawingml/2006/main">
+              <a:graphicData uri="http://schemas.openxmlformats.org/drawingml/2006/picture">
+                <pic:pic xmlns:pic="http://schemas.openxmlformats.org/drawingml/2006/picture">
+                  <pic:nvPicPr>
+                    <pic:cNvPr id="0" name=""/>
+                    <pic:cNvPicPr/>
+                  </pic:nvPicPr>
+                  <pic:blipFill>
+                    <a:blip r:embed="rId30"/>
+                    <a:stretch>
+                      <a:fillRect/>
+                    </a:stretch>
+                  </pic:blipFill>
+                  <pic:spPr>
+                    <a:xfrm>
+                      <a:off x="0" y="0"/>
+                      <a:ext cx="5040000" cy="2682077"/>
+                    </a:xfrm>
+                    <a:prstGeom prst="rect">
+                      <a:avLst/>
+                    </a:prstGeom>
+                  </pic:spPr>
+                </pic:pic>
+              </a:graphicData>
+            </a:graphic>
+          </wp:inline>
+        </w:drawing>
+      </w:r>
+    </w:p>
+    <w:p>
+      <w:pPr>
+        <w:pStyle w:val="ListParagraph"/>
+        <w:rPr>
+          <w:rFonts w:asciiTheme="majorHAnsi" w:hAnsiTheme="majorHAnsi" w:cstheme="majorHAnsi"/>
+          <w:b/>
+          <w:bCs/>
+        </w:rPr>
+      </w:pPr>
+      <w:r>
+        <w:rPr>
+          <w:rFonts w:asciiTheme="majorHAnsi" w:hAnsiTheme="majorHAnsi" w:cstheme="majorHAnsi"/>
+        </w:rPr>
+        <w:t xml:space="preserve">Address diatas akan mengarahkan ke </w:t>
+      </w:r>
+      <w:r>
+        <w:rPr>
+          <w:rFonts w:asciiTheme="majorHAnsi" w:hAnsiTheme="majorHAnsi" w:cstheme="majorHAnsi"/>
+          <w:b/>
+          <w:bCs/>
+        </w:rPr>
+        <w:t>localhost:8080/Login</w:t>
+      </w:r>
+      <w:r>
+        <w:rPr>
+          <w:rFonts w:asciiTheme="majorHAnsi" w:hAnsiTheme="majorHAnsi" w:cstheme="majorHAnsi"/>
+        </w:rPr>
+        <w:t>, karena user belum login</w:t>
+      </w:r>
+    </w:p>
+    <w:p>
+      <w:pPr>
+        <w:pStyle w:val="ListParagraph"/>
+        <w:numPr>
+          <w:ilvl w:val="0"/>
+          <w:numId w:val="14"/>
+        </w:numPr>
+        <w:rPr>
+          <w:rFonts w:asciiTheme="majorHAnsi" w:hAnsiTheme="majorHAnsi" w:cstheme="majorHAnsi"/>
+        </w:rPr>
+      </w:pPr>
+      <w:r>
+        <w:rPr>
+          <w:rFonts w:asciiTheme="majorHAnsi" w:hAnsiTheme="majorHAnsi" w:cstheme="majorHAnsi"/>
+        </w:rPr>
+        <w:t xml:space="preserve">Buka file </w:t>
+      </w:r>
+      <w:r>
+        <w:rPr>
+          <w:rFonts w:asciiTheme="majorHAnsi" w:hAnsiTheme="majorHAnsi" w:cstheme="majorHAnsi"/>
+          <w:b/>
+          <w:bCs/>
+        </w:rPr>
+        <w:t>Login.php</w:t>
+      </w:r>
+      <w:r>
+        <w:rPr>
+          <w:rFonts w:asciiTheme="majorHAnsi" w:hAnsiTheme="majorHAnsi" w:cstheme="majorHAnsi"/>
+        </w:rPr>
+        <w:t xml:space="preserve"> pada folder </w:t>
+      </w:r>
+      <w:r>
+        <w:rPr>
+          <w:rFonts w:asciiTheme="majorHAnsi" w:hAnsiTheme="majorHAnsi" w:cstheme="majorHAnsi"/>
+          <w:b/>
+          <w:bCs/>
+        </w:rPr>
+        <w:t>app\Controllers</w:t>
+      </w:r>
+      <w:r>
+        <w:rPr>
+          <w:rFonts w:asciiTheme="majorHAnsi" w:hAnsiTheme="majorHAnsi" w:cstheme="majorHAnsi"/>
+        </w:rPr>
+        <w:t xml:space="preserve"> dan tambahkan kode berikut</w:t>
+      </w:r>
+    </w:p>
+    <w:p>
+      <w:pPr>
+        <w:pStyle w:val="ListParagraph"/>
+        <w:rPr>
+          <w:rFonts w:asciiTheme="majorHAnsi" w:hAnsiTheme="majorHAnsi" w:cstheme="majorHAnsi"/>
+        </w:rPr>
+      </w:pPr>
+      <w:r>
+        <w:rPr>
+          <w:rFonts w:asciiTheme="majorHAnsi" w:hAnsiTheme="majorHAnsi" w:cstheme="majorHAnsi"/>
+          <w:noProof/>
+          <w:lang w:val="en-US" w:eastAsia="en-US"/>
+        </w:rPr>
+        <w:drawing>
+          <wp:inline distT="0" distB="0" distL="0" distR="0" wp14:anchorId="60FF3D26" wp14:editId="3AD9CA60">
+            <wp:extent cx="5040000" cy="3523376"/>
+            <wp:effectExtent l="0" t="0" r="8255" b="1270"/>
+            <wp:docPr id="243" name="Picture 243"/>
             <wp:cNvGraphicFramePr>
               <a:graphicFrameLocks xmlns:a="http://schemas.openxmlformats.org/drawingml/2006/main" noChangeAspect="1"/>
             </wp:cNvGraphicFramePr>
@@ -9324,7 +9214,7 @@
                   <pic:spPr>
                     <a:xfrm>
                       <a:off x="0" y="0"/>
-                      <a:ext cx="3572374" cy="1276528"/>
+                      <a:ext cx="5040000" cy="3523376"/>
                     </a:xfrm>
                     <a:prstGeom prst="rect">
                       <a:avLst/>
@@ -9339,6 +9229,19 @@
     </w:p>
     <w:p>
       <w:pPr>
+        <w:rPr>
+          <w:rFonts w:asciiTheme="majorHAnsi" w:hAnsiTheme="majorHAnsi" w:cstheme="majorHAnsi"/>
+        </w:rPr>
+      </w:pPr>
+      <w:r>
+        <w:rPr>
+          <w:rFonts w:asciiTheme="majorHAnsi" w:hAnsiTheme="majorHAnsi" w:cstheme="majorHAnsi"/>
+        </w:rPr>
+        <w:br w:type="page"/>
+      </w:r>
+    </w:p>
+    <w:p>
+      <w:pPr>
         <w:pStyle w:val="ListParagraph"/>
         <w:numPr>
           <w:ilvl w:val="0"/>
@@ -9355,6 +9258,7 @@
           <w:szCs w:val="22"/>
           <w:lang w:val="id" w:eastAsia="en-US"/>
         </w:rPr>
+        <w:lastRenderedPageBreak/>
         <w:t>Jalankan</w:t>
       </w:r>
       <w:r>
@@ -9412,10 +9316,10 @@
           <w:lang w:val="en-US" w:eastAsia="en-US"/>
         </w:rPr>
         <w:drawing>
-          <wp:inline distT="0" distB="0" distL="0" distR="0" wp14:anchorId="42D14A15" wp14:editId="7213D63A">
+          <wp:inline distT="0" distB="0" distL="0" distR="0" wp14:anchorId="5D11C88E" wp14:editId="0E47D112">
             <wp:extent cx="5040000" cy="2682077"/>
             <wp:effectExtent l="0" t="0" r="8255" b="4445"/>
-            <wp:docPr id="251" name="Picture 251"/>
+            <wp:docPr id="29" name="Picture 29"/>
             <wp:cNvGraphicFramePr>
               <a:graphicFrameLocks xmlns:a="http://schemas.openxmlformats.org/drawingml/2006/main" noChangeAspect="1"/>
             </wp:cNvGraphicFramePr>
@@ -9427,7 +9331,7 @@
                     <pic:cNvPicPr/>
                   </pic:nvPicPr>
                   <pic:blipFill>
-                    <a:blip r:embed="rId27"/>
+                    <a:blip r:embed="rId30"/>
                     <a:stretch>
                       <a:fillRect/>
                     </a:stretch>
@@ -9453,10 +9357,10 @@
         <w:pStyle w:val="ListParagraph"/>
         <w:rPr>
           <w:rFonts w:asciiTheme="majorHAnsi" w:hAnsiTheme="majorHAnsi" w:cstheme="majorHAnsi"/>
-          <w:b/>
-          <w:bCs/>
-        </w:rPr>
-      </w:pPr>
+        </w:rPr>
+      </w:pPr>
+      <w:bookmarkStart w:id="0" w:name="_GoBack"/>
+      <w:bookmarkEnd w:id="0"/>
       <w:r>
         <w:rPr>
           <w:rFonts w:asciiTheme="majorHAnsi" w:hAnsiTheme="majorHAnsi" w:cstheme="majorHAnsi"/>
@@ -9525,6 +9429,8 @@
         <w:pStyle w:val="ListParagraph"/>
         <w:rPr>
           <w:rFonts w:asciiTheme="majorHAnsi" w:hAnsiTheme="majorHAnsi" w:cstheme="majorHAnsi"/>
+          <w:b/>
+          <w:bCs/>
         </w:rPr>
       </w:pPr>
       <w:r>
@@ -9569,14 +9475,6 @@
           </wp:inline>
         </w:drawing>
       </w:r>
-    </w:p>
-    <w:p>
-      <w:pPr>
-        <w:pStyle w:val="ListParagraph"/>
-        <w:rPr>
-          <w:rFonts w:asciiTheme="majorHAnsi" w:hAnsiTheme="majorHAnsi" w:cstheme="majorHAnsi"/>
-        </w:rPr>
-      </w:pPr>
     </w:p>
     <w:p>
       <w:pPr>
@@ -9900,7 +9798,7 @@
         <w:noProof/>
         <w:color w:val="FFFFFF"/>
       </w:rPr>
-      <w:t>8</w:t>
+      <w:t>16</w:t>
     </w:r>
     <w:r>
       <w:rPr>
@@ -9980,7 +9878,7 @@
         </mc:Choice>
         <mc:Fallback>
           <w:pict>
-            <v:rect id="Rectangle 2" o:spid="_x0000_s1037" alt="Description: decorative element" style="position:absolute;left:0;text-align:left;margin-left:-73pt;margin-top:-5pt;width:617.5pt;height:41pt;z-index:251669504;visibility:visible;mso-wrap-style:square;mso-wrap-distance-left:0;mso-wrap-distance-top:0;mso-wrap-distance-right:0;mso-wrap-distance-bottom:0;mso-position-horizontal:absolute;mso-position-horizontal-relative:text;mso-position-vertical:absolute;mso-position-vertical-relative:text;v-text-anchor:middle" o:gfxdata="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" fillcolor="#4f81bd [3204]" stroked="f">
+            <v:rect id="Rectangle 2" o:spid="_x0000_s1048" alt="Description: decorative element" style="position:absolute;left:0;text-align:left;margin-left:-73pt;margin-top:-5pt;width:617.5pt;height:41pt;z-index:251669504;visibility:visible;mso-wrap-style:square;mso-wrap-distance-left:0;mso-wrap-distance-top:0;mso-wrap-distance-right:0;mso-wrap-distance-bottom:0;mso-position-horizontal:absolute;mso-position-horizontal-relative:text;mso-position-vertical:absolute;mso-position-vertical-relative:text;v-text-anchor:middle" o:gfxdata="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" fillcolor="#4f81bd [3204]" stroked="f">
               <v:fill color2="#1482ab" angle="270" colors="0 #4f81bd;62259f #1482ab;1 #1482ab" focus="100%" type="gradient">
                 <o:fill v:ext="view" type="gradientUnscaled"/>
               </v:fill>
@@ -10093,7 +9991,7 @@
         </mc:Choice>
         <mc:Fallback>
           <w:pict>
-            <v:rect id="Rectangle 6" o:spid="_x0000_s1038" style="position:absolute;left:0;text-align:left;margin-left:-17pt;margin-top:-7.4pt;width:186.65pt;height:44.55pt;z-index:251670528;visibility:visible;mso-wrap-style:square;mso-wrap-distance-left:9pt;mso-wrap-distance-top:3.6pt;mso-wrap-distance-right:9pt;mso-wrap-distance-bottom:3.6pt;mso-position-horizontal:absolute;mso-position-horizontal-relative:text;mso-position-vertical:absolute;mso-position-vertical-relative:text;v-text-anchor:top" o:gfxdata="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" filled="f" stroked="f">
+            <v:rect id="Rectangle 6" o:spid="_x0000_s1049" style="position:absolute;left:0;text-align:left;margin-left:-17pt;margin-top:-7.4pt;width:186.65pt;height:44.55pt;z-index:251670528;visibility:visible;mso-wrap-style:square;mso-wrap-distance-left:9pt;mso-wrap-distance-top:3.6pt;mso-wrap-distance-right:9pt;mso-wrap-distance-bottom:3.6pt;mso-position-horizontal:absolute;mso-position-horizontal-relative:text;mso-position-vertical:absolute;mso-position-vertical-relative:text;v-text-anchor:top" o:gfxdata="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" filled="f" stroked="f">
               <v:textbox inset="2.53958mm,1.2694mm,2.53958mm,1.2694mm">
                 <w:txbxContent>
                   <w:p>
@@ -10595,7 +10493,7 @@
         </mc:Choice>
         <mc:Fallback>
           <w:pict>
-            <v:rect id="Rectangle 10" o:spid="_x0000_s1035" alt="Description: decorative element" style="position:absolute;margin-left:-1in;margin-top:-18pt;width:617.55pt;height:36pt;z-index:251659264;visibility:visible;mso-wrap-style:square;mso-wrap-distance-left:9pt;mso-wrap-distance-top:0;mso-wrap-distance-right:9pt;mso-wrap-distance-bottom:0;mso-position-horizontal:absolute;mso-position-horizontal-relative:text;mso-position-vertical:absolute;mso-position-vertical-relative:text;v-text-anchor:middle" o:gfxdata="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" fillcolor="#4f81bd [3204]" stroked="f">
+            <v:rect id="Rectangle 10" o:spid="_x0000_s1046" alt="Description: decorative element" style="position:absolute;margin-left:-1in;margin-top:-18pt;width:617.55pt;height:36pt;z-index:251659264;visibility:visible;mso-wrap-style:square;mso-wrap-distance-left:9pt;mso-wrap-distance-top:0;mso-wrap-distance-right:9pt;mso-wrap-distance-bottom:0;mso-position-horizontal:absolute;mso-position-horizontal-relative:text;mso-position-vertical:absolute;mso-position-vertical-relative:text;v-text-anchor:middle" o:gfxdata="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" fillcolor="#4f81bd [3204]" stroked="f">
               <v:fill color2="#1482ab" angle="270" colors="0 #4f81bd;62259f #1482ab;1 #1482ab" focus="100%" type="gradient">
                 <o:fill v:ext="view" type="gradientUnscaled"/>
               </v:fill>
@@ -10755,7 +10653,7 @@
         </mc:Choice>
         <mc:Fallback>
           <w:pict>
-            <v:rect id="Rectangle 11" o:spid="_x0000_s1036" style="position:absolute;margin-left:-14pt;margin-top:-17.4pt;width:186.65pt;height:34.55pt;z-index:251661312;visibility:visible;mso-wrap-style:square;mso-wrap-distance-left:9pt;mso-wrap-distance-top:3.6pt;mso-wrap-distance-right:9pt;mso-wrap-distance-bottom:3.6pt;mso-position-horizontal:absolute;mso-position-horizontal-relative:text;mso-position-vertical:absolute;mso-position-vertical-relative:text;v-text-anchor:top" o:gfxdata="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" filled="f" stroked="f">
+            <v:rect id="Rectangle 11" o:spid="_x0000_s1047" style="position:absolute;margin-left:-14pt;margin-top:-17.4pt;width:186.65pt;height:34.55pt;z-index:251661312;visibility:visible;mso-wrap-style:square;mso-wrap-distance-left:9pt;mso-wrap-distance-top:3.6pt;mso-wrap-distance-right:9pt;mso-wrap-distance-bottom:3.6pt;mso-position-horizontal:absolute;mso-position-horizontal-relative:text;mso-position-vertical:absolute;mso-position-vertical-relative:text;v-text-anchor:top" o:gfxdata="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" filled="f" stroked="f">
               <v:textbox inset="2.53958mm,1.2694mm,2.53958mm,1.2694mm">
                 <w:txbxContent>
                   <w:p>
@@ -10939,7 +10837,7 @@
                       <wps:cNvPr id="5" name="Parallelogram 12">
                         <a:extLst>
                           <a:ext uri="{FF2B5EF4-FFF2-40B4-BE49-F238E27FC236}">
-                            <a16:creationId xmlns="" xmlns:cx="http://schemas.microsoft.com/office/drawing/2014/chartex" xmlns:cx1="http://schemas.microsoft.com/office/drawing/2015/9/8/chartex" xmlns:cx2="http://schemas.microsoft.com/office/drawing/2015/10/21/chartex" xmlns:cx3="http://schemas.microsoft.com/office/drawing/2016/5/9/chartex" xmlns:cx4="http://schemas.microsoft.com/office/drawing/2016/5/10/chartex" xmlns:cx5="http://schemas.microsoft.com/office/drawing/2016/5/11/chartex" xmlns:cx6="http://schemas.microsoft.com/office/drawing/2016/5/12/chartex" xmlns:cx7="http://schemas.microsoft.com/office/drawing/2016/5/13/chartex" xmlns:cx8="http://schemas.microsoft.com/office/drawing/2016/5/14/chartex" xmlns:aink="http://schemas.microsoft.com/office/drawing/2016/ink" xmlns:am3d="http://schemas.microsoft.com/office/drawing/2017/model3d" xmlns:o="urn:schemas-microsoft-com:office:office" xmlns:v="urn:schemas-microsoft-com:vml" xmlns:w10="urn:schemas-microsoft-com:office:word" xmlns:w="http://schemas.openxmlformats.org/wordprocessingml/2006/main" xmlns:w16cex="http://schemas.microsoft.com/office/word/2018/wordml/cex" xmlns:w16cid="http://schemas.microsoft.com/office/word/2016/wordml/cid" xmlns:w16="http://schemas.microsoft.com/office/word/2018/wordml" xmlns:w16se="http://schemas.microsoft.com/office/word/2015/wordml/symex" xmlns:a16="http://schemas.microsoft.com/office/drawing/2014/main" xmlns:w15="http://schemas.microsoft.com/office/word/2012/wordml" id="{0DF4DB2E-1B08-B444-B2FC-E7FB68181731}"/>
+                            <a16:creationId xmlns:w15="http://schemas.microsoft.com/office/word/2012/wordml" xmlns:a16="http://schemas.microsoft.com/office/drawing/2014/main" xmlns:w16se="http://schemas.microsoft.com/office/word/2015/wordml/symex" xmlns:w16="http://schemas.microsoft.com/office/word/2018/wordml" xmlns:w16cid="http://schemas.microsoft.com/office/word/2016/wordml/cid" xmlns:w16cex="http://schemas.microsoft.com/office/word/2018/wordml/cex" xmlns:w="http://schemas.openxmlformats.org/wordprocessingml/2006/main" xmlns:w10="urn:schemas-microsoft-com:office:word" xmlns:v="urn:schemas-microsoft-com:vml" xmlns:o="urn:schemas-microsoft-com:office:office" xmlns:am3d="http://schemas.microsoft.com/office/drawing/2017/model3d" xmlns:aink="http://schemas.microsoft.com/office/drawing/2016/ink" xmlns:cx8="http://schemas.microsoft.com/office/drawing/2016/5/14/chartex" xmlns:cx7="http://schemas.microsoft.com/office/drawing/2016/5/13/chartex" xmlns:cx6="http://schemas.microsoft.com/office/drawing/2016/5/12/chartex" xmlns:cx5="http://schemas.microsoft.com/office/drawing/2016/5/11/chartex" xmlns:cx4="http://schemas.microsoft.com/office/drawing/2016/5/10/chartex" xmlns:cx3="http://schemas.microsoft.com/office/drawing/2016/5/9/chartex" xmlns:cx2="http://schemas.microsoft.com/office/drawing/2015/10/21/chartex" xmlns:cx1="http://schemas.microsoft.com/office/drawing/2015/9/8/chartex" xmlns:cx="http://schemas.microsoft.com/office/drawing/2014/chartex" xmlns="" id="{0DF4DB2E-1B08-B444-B2FC-E7FB68181731}"/>
                           </a:ext>
                         </a:extLst>
                       </wps:cNvPr>
@@ -11923,15 +11821,7 @@
                               <w:color w:val="FFFFFF" w:themeColor="background1"/>
                               <w:sz w:val="60"/>
                             </w:rPr>
-                            <w:t xml:space="preserve">MODUL </w:t>
-                          </w:r>
-                          <w:r>
-                            <w:rPr>
-                              <w:b/>
-                              <w:color w:val="FFFFFF" w:themeColor="background1"/>
-                              <w:sz w:val="60"/>
-                            </w:rPr>
-                            <w:t>PERKULIAHAN</w:t>
+                            <w:t>MODUL PERKULIAHAN</w:t>
                           </w:r>
                         </w:p>
                       </w:txbxContent>
@@ -11970,15 +11860,7 @@
                         <w:color w:val="FFFFFF" w:themeColor="background1"/>
                         <w:sz w:val="60"/>
                       </w:rPr>
-                      <w:t xml:space="preserve">MODUL </w:t>
-                    </w:r>
-                    <w:r>
-                      <w:rPr>
-                        <w:b/>
-                        <w:color w:val="FFFFFF" w:themeColor="background1"/>
-                        <w:sz w:val="60"/>
-                      </w:rPr>
-                      <w:t>PERKULIAHAN</w:t>
+                      <w:t>MODUL PERKULIAHAN</w:t>
                     </w:r>
                   </w:p>
                 </w:txbxContent>
@@ -12011,7 +11893,7 @@
               <wp:docPr id="33" name="Freeform 19">
                 <a:extLst xmlns:a="http://schemas.openxmlformats.org/drawingml/2006/main">
                   <a:ext uri="{FF2B5EF4-FFF2-40B4-BE49-F238E27FC236}">
-                    <a16:creationId xmlns="" xmlns:cx="http://schemas.microsoft.com/office/drawing/2014/chartex" xmlns:cx1="http://schemas.microsoft.com/office/drawing/2015/9/8/chartex" xmlns:cx2="http://schemas.microsoft.com/office/drawing/2015/10/21/chartex" xmlns:cx3="http://schemas.microsoft.com/office/drawing/2016/5/9/chartex" xmlns:cx4="http://schemas.microsoft.com/office/drawing/2016/5/10/chartex" xmlns:cx5="http://schemas.microsoft.com/office/drawing/2016/5/11/chartex" xmlns:cx6="http://schemas.microsoft.com/office/drawing/2016/5/12/chartex" xmlns:cx7="http://schemas.microsoft.com/office/drawing/2016/5/13/chartex" xmlns:cx8="http://schemas.microsoft.com/office/drawing/2016/5/14/chartex" xmlns:aink="http://schemas.microsoft.com/office/drawing/2016/ink" xmlns:am3d="http://schemas.microsoft.com/office/drawing/2017/model3d" xmlns:o="urn:schemas-microsoft-com:office:office" xmlns:v="urn:schemas-microsoft-com:vml" xmlns:w10="urn:schemas-microsoft-com:office:word" xmlns:w="http://schemas.openxmlformats.org/wordprocessingml/2006/main" xmlns:w16cex="http://schemas.microsoft.com/office/word/2018/wordml/cex" xmlns:w16cid="http://schemas.microsoft.com/office/word/2016/wordml/cid" xmlns:w16="http://schemas.microsoft.com/office/word/2018/wordml" xmlns:w16se="http://schemas.microsoft.com/office/word/2015/wordml/symex" xmlns:a16="http://schemas.microsoft.com/office/drawing/2014/main" xmlns:w15="http://schemas.microsoft.com/office/word/2012/wordml" id="{7E1B7167-0843-9649-8C5E-3D07F055F899}"/>
+                    <a16:creationId xmlns:w15="http://schemas.microsoft.com/office/word/2012/wordml" xmlns:a16="http://schemas.microsoft.com/office/drawing/2014/main" xmlns:w16se="http://schemas.microsoft.com/office/word/2015/wordml/symex" xmlns:w16="http://schemas.microsoft.com/office/word/2018/wordml" xmlns:w16cid="http://schemas.microsoft.com/office/word/2016/wordml/cid" xmlns:w16cex="http://schemas.microsoft.com/office/word/2018/wordml/cex" xmlns:w="http://schemas.openxmlformats.org/wordprocessingml/2006/main" xmlns:w10="urn:schemas-microsoft-com:office:word" xmlns:v="urn:schemas-microsoft-com:vml" xmlns:o="urn:schemas-microsoft-com:office:office" xmlns:am3d="http://schemas.microsoft.com/office/drawing/2017/model3d" xmlns:aink="http://schemas.microsoft.com/office/drawing/2016/ink" xmlns:cx8="http://schemas.microsoft.com/office/drawing/2016/5/14/chartex" xmlns:cx7="http://schemas.microsoft.com/office/drawing/2016/5/13/chartex" xmlns:cx6="http://schemas.microsoft.com/office/drawing/2016/5/12/chartex" xmlns:cx5="http://schemas.microsoft.com/office/drawing/2016/5/11/chartex" xmlns:cx4="http://schemas.microsoft.com/office/drawing/2016/5/10/chartex" xmlns:cx3="http://schemas.microsoft.com/office/drawing/2016/5/9/chartex" xmlns:cx2="http://schemas.microsoft.com/office/drawing/2015/10/21/chartex" xmlns:cx1="http://schemas.microsoft.com/office/drawing/2015/9/8/chartex" xmlns:cx="http://schemas.microsoft.com/office/drawing/2014/chartex" xmlns="" id="{7E1B7167-0843-9649-8C5E-3D07F055F899}"/>
                   </a:ext>
                 </a:extLst>
               </wp:docPr>
@@ -12602,6 +12484,92 @@
     </w:lvl>
   </w:abstractNum>
   <w:abstractNum w:abstractNumId="5">
+    <w:nsid w:val="242F6B32"/>
+    <w:multiLevelType w:val="hybridMultilevel"/>
+    <w:tmpl w:val="D9E60FB0"/>
+    <w:lvl w:ilvl="0" w:tplc="0421000F">
+      <w:start w:val="1"/>
+      <w:numFmt w:val="decimal"/>
+      <w:lvlText w:val="%1."/>
+      <w:lvlJc w:val="left"/>
+      <w:pPr>
+        <w:ind w:left="720" w:hanging="360"/>
+      </w:pPr>
+    </w:lvl>
+    <w:lvl w:ilvl="1" w:tplc="04210019" w:tentative="1">
+      <w:start w:val="1"/>
+      <w:numFmt w:val="lowerLetter"/>
+      <w:lvlText w:val="%2."/>
+      <w:lvlJc w:val="left"/>
+      <w:pPr>
+        <w:ind w:left="1440" w:hanging="360"/>
+      </w:pPr>
+    </w:lvl>
+    <w:lvl w:ilvl="2" w:tplc="0421001B" w:tentative="1">
+      <w:start w:val="1"/>
+      <w:numFmt w:val="lowerRoman"/>
+      <w:lvlText w:val="%3."/>
+      <w:lvlJc w:val="right"/>
+      <w:pPr>
+        <w:ind w:left="2160" w:hanging="180"/>
+      </w:pPr>
+    </w:lvl>
+    <w:lvl w:ilvl="3" w:tplc="0421000F" w:tentative="1">
+      <w:start w:val="1"/>
+      <w:numFmt w:val="decimal"/>
+      <w:lvlText w:val="%4."/>
+      <w:lvlJc w:val="left"/>
+      <w:pPr>
+        <w:ind w:left="2880" w:hanging="360"/>
+      </w:pPr>
+    </w:lvl>
+    <w:lvl w:ilvl="4" w:tplc="04210019" w:tentative="1">
+      <w:start w:val="1"/>
+      <w:numFmt w:val="lowerLetter"/>
+      <w:lvlText w:val="%5."/>
+      <w:lvlJc w:val="left"/>
+      <w:pPr>
+        <w:ind w:left="3600" w:hanging="360"/>
+      </w:pPr>
+    </w:lvl>
+    <w:lvl w:ilvl="5" w:tplc="0421001B" w:tentative="1">
+      <w:start w:val="1"/>
+      <w:numFmt w:val="lowerRoman"/>
+      <w:lvlText w:val="%6."/>
+      <w:lvlJc w:val="right"/>
+      <w:pPr>
+        <w:ind w:left="4320" w:hanging="180"/>
+      </w:pPr>
+    </w:lvl>
+    <w:lvl w:ilvl="6" w:tplc="0421000F" w:tentative="1">
+      <w:start w:val="1"/>
+      <w:numFmt w:val="decimal"/>
+      <w:lvlText w:val="%7."/>
+      <w:lvlJc w:val="left"/>
+      <w:pPr>
+        <w:ind w:left="5040" w:hanging="360"/>
+      </w:pPr>
+    </w:lvl>
+    <w:lvl w:ilvl="7" w:tplc="04210019" w:tentative="1">
+      <w:start w:val="1"/>
+      <w:numFmt w:val="lowerLetter"/>
+      <w:lvlText w:val="%8."/>
+      <w:lvlJc w:val="left"/>
+      <w:pPr>
+        <w:ind w:left="5760" w:hanging="360"/>
+      </w:pPr>
+    </w:lvl>
+    <w:lvl w:ilvl="8" w:tplc="0421001B" w:tentative="1">
+      <w:start w:val="1"/>
+      <w:numFmt w:val="lowerRoman"/>
+      <w:lvlText w:val="%9."/>
+      <w:lvlJc w:val="right"/>
+      <w:pPr>
+        <w:ind w:left="6480" w:hanging="180"/>
+      </w:pPr>
+    </w:lvl>
+  </w:abstractNum>
+  <w:abstractNum w:abstractNumId="6">
     <w:nsid w:val="265704D6"/>
     <w:multiLevelType w:val="multilevel"/>
     <w:tmpl w:val="7772C92E"/>
@@ -12714,7 +12682,7 @@
       </w:rPr>
     </w:lvl>
   </w:abstractNum>
-  <w:abstractNum w:abstractNumId="6">
+  <w:abstractNum w:abstractNumId="7">
     <w:nsid w:val="2852146B"/>
     <w:multiLevelType w:val="hybridMultilevel"/>
     <w:tmpl w:val="10CE1DDC"/>
@@ -12827,7 +12795,7 @@
       </w:rPr>
     </w:lvl>
   </w:abstractNum>
-  <w:abstractNum w:abstractNumId="7">
+  <w:abstractNum w:abstractNumId="8">
     <w:nsid w:val="355C4C34"/>
     <w:multiLevelType w:val="multilevel"/>
     <w:tmpl w:val="35EAD458"/>
@@ -12940,7 +12908,7 @@
       </w:rPr>
     </w:lvl>
   </w:abstractNum>
-  <w:abstractNum w:abstractNumId="8">
+  <w:abstractNum w:abstractNumId="9">
     <w:nsid w:val="361B7664"/>
     <w:multiLevelType w:val="multilevel"/>
     <w:tmpl w:val="5F78DA6A"/>
@@ -13053,7 +13021,7 @@
       </w:rPr>
     </w:lvl>
   </w:abstractNum>
-  <w:abstractNum w:abstractNumId="9">
+  <w:abstractNum w:abstractNumId="10">
     <w:nsid w:val="43560949"/>
     <w:multiLevelType w:val="hybridMultilevel"/>
     <w:tmpl w:val="FA0C265E"/>
@@ -13139,7 +13107,7 @@
       </w:pPr>
     </w:lvl>
   </w:abstractNum>
-  <w:abstractNum w:abstractNumId="10">
+  <w:abstractNum w:abstractNumId="11">
     <w:nsid w:val="4D8F2E88"/>
     <w:multiLevelType w:val="hybridMultilevel"/>
     <w:tmpl w:val="6BBC929C"/>
@@ -13225,7 +13193,7 @@
       </w:pPr>
     </w:lvl>
   </w:abstractNum>
-  <w:abstractNum w:abstractNumId="11">
+  <w:abstractNum w:abstractNumId="12">
     <w:nsid w:val="4EBD75DB"/>
     <w:multiLevelType w:val="hybridMultilevel"/>
     <w:tmpl w:val="57BC350C"/>
@@ -13338,7 +13306,7 @@
       </w:rPr>
     </w:lvl>
   </w:abstractNum>
-  <w:abstractNum w:abstractNumId="12">
+  <w:abstractNum w:abstractNumId="13">
     <w:nsid w:val="59E023A6"/>
     <w:multiLevelType w:val="multilevel"/>
     <w:tmpl w:val="B1AA44B8"/>
@@ -13451,7 +13419,7 @@
       </w:rPr>
     </w:lvl>
   </w:abstractNum>
-  <w:abstractNum w:abstractNumId="13">
+  <w:abstractNum w:abstractNumId="14">
     <w:nsid w:val="5B592B9A"/>
     <w:multiLevelType w:val="multilevel"/>
     <w:tmpl w:val="FA72833A"/>
@@ -13564,7 +13532,7 @@
       </w:rPr>
     </w:lvl>
   </w:abstractNum>
-  <w:abstractNum w:abstractNumId="14">
+  <w:abstractNum w:abstractNumId="15">
     <w:nsid w:val="623C64A9"/>
     <w:multiLevelType w:val="multilevel"/>
     <w:tmpl w:val="EDAA3B0E"/>
@@ -13677,7 +13645,7 @@
       </w:rPr>
     </w:lvl>
   </w:abstractNum>
-  <w:abstractNum w:abstractNumId="15">
+  <w:abstractNum w:abstractNumId="16">
     <w:nsid w:val="66F92493"/>
     <w:multiLevelType w:val="multilevel"/>
     <w:tmpl w:val="97F8783C"/>
@@ -13763,7 +13731,7 @@
       </w:pPr>
     </w:lvl>
   </w:abstractNum>
-  <w:abstractNum w:abstractNumId="16">
+  <w:abstractNum w:abstractNumId="17">
     <w:nsid w:val="676A1B08"/>
     <w:multiLevelType w:val="multilevel"/>
     <w:tmpl w:val="8B3C0ECE"/>
@@ -13876,10 +13844,10 @@
       </w:rPr>
     </w:lvl>
   </w:abstractNum>
-  <w:abstractNum w:abstractNumId="17">
+  <w:abstractNum w:abstractNumId="18">
     <w:nsid w:val="6B0E5175"/>
     <w:multiLevelType w:val="hybridMultilevel"/>
-    <w:tmpl w:val="D9E60FB0"/>
+    <w:tmpl w:val="53B0E75E"/>
     <w:lvl w:ilvl="0" w:tplc="0421000F">
       <w:start w:val="1"/>
       <w:numFmt w:val="decimal"/>
@@ -13962,7 +13930,7 @@
       </w:pPr>
     </w:lvl>
   </w:abstractNum>
-  <w:abstractNum w:abstractNumId="18">
+  <w:abstractNum w:abstractNumId="19">
     <w:nsid w:val="6B3405A5"/>
     <w:multiLevelType w:val="hybridMultilevel"/>
     <w:tmpl w:val="56EE39D0"/>
@@ -14052,58 +14020,61 @@
     <w:abstractNumId w:val="2"/>
   </w:num>
   <w:num w:numId="2">
-    <w:abstractNumId w:val="5"/>
+    <w:abstractNumId w:val="6"/>
   </w:num>
   <w:num w:numId="3">
-    <w:abstractNumId w:val="7"/>
+    <w:abstractNumId w:val="8"/>
   </w:num>
   <w:num w:numId="4">
-    <w:abstractNumId w:val="13"/>
+    <w:abstractNumId w:val="14"/>
   </w:num>
   <w:num w:numId="5">
-    <w:abstractNumId w:val="14"/>
+    <w:abstractNumId w:val="15"/>
   </w:num>
   <w:num w:numId="6">
     <w:abstractNumId w:val="0"/>
   </w:num>
   <w:num w:numId="7">
-    <w:abstractNumId w:val="8"/>
+    <w:abstractNumId w:val="9"/>
   </w:num>
   <w:num w:numId="8">
-    <w:abstractNumId w:val="12"/>
+    <w:abstractNumId w:val="13"/>
   </w:num>
   <w:num w:numId="9">
-    <w:abstractNumId w:val="16"/>
+    <w:abstractNumId w:val="17"/>
   </w:num>
   <w:num w:numId="10">
     <w:abstractNumId w:val="4"/>
   </w:num>
   <w:num w:numId="11">
-    <w:abstractNumId w:val="15"/>
+    <w:abstractNumId w:val="16"/>
   </w:num>
   <w:num w:numId="12">
     <w:abstractNumId w:val="3"/>
   </w:num>
   <w:num w:numId="13">
+    <w:abstractNumId w:val="19"/>
+  </w:num>
+  <w:num w:numId="14">
     <w:abstractNumId w:val="18"/>
   </w:num>
-  <w:num w:numId="14">
-    <w:abstractNumId w:val="17"/>
-  </w:num>
   <w:num w:numId="15">
-    <w:abstractNumId w:val="11"/>
+    <w:abstractNumId w:val="12"/>
   </w:num>
   <w:num w:numId="16">
-    <w:abstractNumId w:val="6"/>
+    <w:abstractNumId w:val="7"/>
   </w:num>
   <w:num w:numId="17">
-    <w:abstractNumId w:val="10"/>
+    <w:abstractNumId w:val="11"/>
   </w:num>
   <w:num w:numId="18">
     <w:abstractNumId w:val="1"/>
   </w:num>
   <w:num w:numId="19">
-    <w:abstractNumId w:val="9"/>
+    <w:abstractNumId w:val="10"/>
+  </w:num>
+  <w:num w:numId="20">
+    <w:abstractNumId w:val="5"/>
   </w:num>
 </w:numbering>
 </file>
@@ -15403,7 +15374,7 @@
 </file>
 
 <file path=customXml/itemProps1.xml><?xml version="1.0" encoding="utf-8"?>
-<ds:datastoreItem xmlns:ds="http://schemas.openxmlformats.org/officeDocument/2006/customXml" ds:itemID="{F9EB1EBD-FAE8-4B2A-A5C9-0FA14FD55C34}">
+<ds:datastoreItem xmlns:ds="http://schemas.openxmlformats.org/officeDocument/2006/customXml" ds:itemID="{E3BFC35A-8364-43EC-AE75-54963957E043}">
   <ds:schemaRefs>
     <ds:schemaRef ds:uri="http://schemas.openxmlformats.org/officeDocument/2006/bibliography"/>
   </ds:schemaRefs>

</xml_diff>